<commit_message>
feat: add hyperlinks support (v0.3)
- Parse external URLs, mailto, and in-document anchor links from DOCX
- Render hyperlinks as <a class="dw-hyperlink"> with data-dw-href attributes
- Parse hyperlinks from docwow HTML back to Hyperlink model
- Write external hyperlinks as w:hyperlink r:id with External rels entry
- Write anchor links as w:hyperlink w:anchor (no rels entry)
- MutableHyperlink API class with set_text/set_url chaining
- RunCollection.add_hyperlink() factory method
- Showcase regenerated on every test run; showcase.html also written
- README updated with full feature support/planned table
- 1385 tests, 98.4% coverage

Co-Authored-By: Claude Sonnet 4.6 <noreply@anthropic.com>
</commit_message>
<xml_diff>
--- a/tests/fixtures/showcase.docx
+++ b/tests/fixtures/showcase.docx
@@ -649,6 +649,56 @@
         </w:tc>
       </w:tr>
     </w:tbl>
+    <w:p>
+      <w:pPr>
+        <w:pStyle w:val="Heading2"/>
+      </w:pPr>
+      <w:r>
+        <w:t xml:space="preserve">Hyperlinks</w:t>
+      </w:r>
+    </w:p>
+    <w:p>
+      <w:pPr/>
+      <w:r>
+        <w:t xml:space="preserve">Visit the </w:t>
+      </w:r>
+      <w:hyperlink r:id="rId5">
+        <w:r>
+          <w:t xml:space="preserve">docwow documentation</w:t>
+        </w:r>
+      </w:hyperlink>
+      <w:r>
+        <w:t xml:space="preserve"> for full details.</w:t>
+      </w:r>
+    </w:p>
+    <w:p>
+      <w:pPr/>
+      <w:r>
+        <w:t xml:space="preserve">Report bugs on </w:t>
+      </w:r>
+      <w:hyperlink r:id="rId6">
+        <w:r>
+          <w:t xml:space="preserve">GitHub Issues</w:t>
+        </w:r>
+      </w:hyperlink>
+      <w:r>
+        <w:t xml:space="preserve">.</w:t>
+      </w:r>
+    </w:p>
+    <w:p>
+      <w:pPr/>
+      <w:r>
+        <w:t xml:space="preserve">Contact us at </w:t>
+      </w:r>
+      <w:hyperlink r:id="rId7">
+        <w:r>
+          <w:t xml:space="preserve">hello@example.com</w:t>
+        </w:r>
+      </w:hyperlink>
+      <w:r>
+        <w:t xml:space="preserve">.</w:t>
+      </w:r>
+    </w:p>
     <w:p>
       <w:pPr>
         <w:pStyle w:val="Heading2"/>

</xml_diff>

<commit_message>
feat: add footnotes & endnotes to showcase fixture
Showcase now includes a 'Footnotes and Endnotes' section with two footnote
references and one endnote reference so the feature is visible in the
standard visual QA file.

Co-Authored-By: Claude Sonnet 4.6 <noreply@anthropic.com>
</commit_message>
<xml_diff>
--- a/tests/fixtures/showcase.docx
+++ b/tests/fixtures/showcase.docx
@@ -700,6 +700,53 @@
       </w:r>
     </w:p>
     <w:p>
+      <w:pPr>
+        <w:pStyle w:val="Heading2"/>
+      </w:pPr>
+      <w:r>
+        <w:t xml:space="preserve">Footnotes and Endnotes</w:t>
+      </w:r>
+    </w:p>
+    <w:p>
+      <w:pPr/>
+      <w:r>
+        <w:t xml:space="preserve">This sentence has a footnote reference</w:t>
+      </w:r>
+      <w:r>
+        <w:rPr>
+          <w:rStyle w:val="FootnoteReference"/>
+        </w:rPr>
+        <w:footnoteReference w:id="1"/>
+      </w:r>
+      <w:r>
+        <w:t xml:space="preserve"> at the end.</w:t>
+      </w:r>
+    </w:p>
+    <w:p>
+      <w:pPr/>
+      <w:r>
+        <w:t xml:space="preserve">A second sentence with another footnote</w:t>
+      </w:r>
+      <w:r>
+        <w:rPr>
+          <w:rStyle w:val="FootnoteReference"/>
+        </w:rPr>
+        <w:footnoteReference w:id="2"/>
+      </w:r>
+      <w:r>
+        <w:t xml:space="preserve"> and an endnote reference</w:t>
+      </w:r>
+      <w:r>
+        <w:rPr>
+          <w:rStyle w:val="EndnoteReference"/>
+        </w:rPr>
+        <w:endnoteReference w:id="1"/>
+      </w:r>
+      <w:r>
+        <w:t xml:space="preserve">.</w:t>
+      </w:r>
+    </w:p>
+    <w:p>
       <w:r>
         <w:br w:type="page"/>
       </w:r>
@@ -811,6 +858,41 @@
 </w:document>
 </file>
 
+<file path=word/endnotes.xml><?xml version="1.0" encoding="utf-8"?>
+<w:endnotes xmlns:w="http://schemas.openxmlformats.org/wordprocessingml/2006/main" xmlns:r="http://schemas.openxmlformats.org/officeDocument/2006/relationships" xmlns:wp="http://schemas.openxmlformats.org/drawingml/2006/wordprocessingDrawing" xmlns:a="http://schemas.openxmlformats.org/drawingml/2006/main" xmlns:pic="http://schemas.openxmlformats.org/drawingml/2006/picture">
+  <w:endnote w:type="separator" w:id="-1">
+    <w:p>
+      <w:r>
+        <w:separator/>
+      </w:r>
+    </w:p>
+  </w:endnote>
+  <w:endnote w:type="continuationSeparator" w:id="0">
+    <w:p>
+      <w:r>
+        <w:continuationSeparator/>
+      </w:r>
+    </w:p>
+  </w:endnote>
+  <w:endnote w:id="1">
+    <w:p>
+      <w:pPr>
+        <w:pStyle w:val="EndnoteText"/>
+      </w:pPr>
+      <w:r>
+        <w:rPr>
+          <w:rStyle w:val="EndnoteReference"/>
+        </w:rPr>
+        <w:endnoteRef/>
+      </w:r>
+      <w:r>
+        <w:t xml:space="preserve">This is an endnote. It appears at the end of the document.</w:t>
+      </w:r>
+    </w:p>
+  </w:endnote>
+</w:endnotes>
+</file>
+
 <file path=word/footer2.xml><?xml version="1.0" encoding="utf-8"?>
 <w:ftr xmlns:w="http://schemas.openxmlformats.org/wordprocessingml/2006/main" xmlns:r="http://schemas.openxmlformats.org/officeDocument/2006/relationships" xmlns:wp="http://schemas.openxmlformats.org/drawingml/2006/wordprocessingDrawing" xmlns:a="http://schemas.openxmlformats.org/drawingml/2006/main" xmlns:pic="http://schemas.openxmlformats.org/drawingml/2006/picture">
   <w:p>
@@ -853,6 +935,57 @@
     </w:r>
   </w:p>
 </w:ftr>
+</file>
+
+<file path=word/footnotes.xml><?xml version="1.0" encoding="utf-8"?>
+<w:footnotes xmlns:w="http://schemas.openxmlformats.org/wordprocessingml/2006/main" xmlns:r="http://schemas.openxmlformats.org/officeDocument/2006/relationships" xmlns:wp="http://schemas.openxmlformats.org/drawingml/2006/wordprocessingDrawing" xmlns:a="http://schemas.openxmlformats.org/drawingml/2006/main" xmlns:pic="http://schemas.openxmlformats.org/drawingml/2006/picture">
+  <w:footnote w:type="separator" w:id="-1">
+    <w:p>
+      <w:r>
+        <w:separator/>
+      </w:r>
+    </w:p>
+  </w:footnote>
+  <w:footnote w:type="continuationSeparator" w:id="0">
+    <w:p>
+      <w:r>
+        <w:continuationSeparator/>
+      </w:r>
+    </w:p>
+  </w:footnote>
+  <w:footnote w:id="1">
+    <w:p>
+      <w:pPr>
+        <w:pStyle w:val="FootnoteText"/>
+      </w:pPr>
+      <w:r>
+        <w:rPr>
+          <w:rStyle w:val="FootnoteReference"/>
+        </w:rPr>
+        <w:footnoteRef/>
+      </w:r>
+      <w:r>
+        <w:t xml:space="preserve">This is the first footnote. It demonstrates the footnote body.</w:t>
+      </w:r>
+    </w:p>
+  </w:footnote>
+  <w:footnote w:id="2">
+    <w:p>
+      <w:pPr>
+        <w:pStyle w:val="FootnoteText"/>
+      </w:pPr>
+      <w:r>
+        <w:rPr>
+          <w:rStyle w:val="FootnoteReference"/>
+        </w:rPr>
+        <w:footnoteRef/>
+      </w:r>
+      <w:r>
+        <w:t xml:space="preserve">Second footnote — attached to the second sentence.</w:t>
+      </w:r>
+    </w:p>
+  </w:footnote>
+</w:footnotes>
 </file>
 
 <file path=word/header1.xml><?xml version="1.0" encoding="utf-8"?>

</xml_diff>

<commit_message>
fix: add _Toc bookmark anchors to showcase headings so TOC links work
Previously the TOC entries in the showcase pointed to _TocShowcase1–5
but no heading had a matching bookmark, so clicking did nothing.
Now the five target headings carry a BookmarkStart run with the
corresponding anchor name, making TOC links functional in the browser.

Co-Authored-By: Claude Sonnet 4.6 <noreply@anthropic.com>
</commit_message>
<xml_diff>
--- a/tests/fixtures/showcase.docx
+++ b/tests/fixtures/showcase.docx
@@ -6,6 +6,8 @@
       <w:pPr>
         <w:pStyle w:val="Heading1"/>
       </w:pPr>
+      <w:bookmarkStart w:id="0" w:name="_TocShowcase1"/>
+      <w:bookmarkEnd w:id="0"/>
       <w:r>
         <w:t xml:space="preserve">docwow Showcase Document</w:t>
       </w:r>
@@ -20,6 +22,8 @@
       <w:pPr>
         <w:pStyle w:val="Heading2"/>
       </w:pPr>
+      <w:bookmarkStart w:id="1" w:name="_TocShowcase2"/>
+      <w:bookmarkEnd w:id="1"/>
       <w:r>
         <w:t xml:space="preserve">Paragraph Formatting</w:t>
       </w:r>
@@ -60,6 +64,8 @@
       <w:pPr>
         <w:pStyle w:val="Heading2"/>
       </w:pPr>
+      <w:bookmarkStart w:id="2" w:name="_TocShowcase3"/>
+      <w:bookmarkEnd w:id="2"/>
       <w:r>
         <w:t xml:space="preserve">Indentation</w:t>
       </w:r>
@@ -114,6 +120,8 @@
       <w:pPr>
         <w:pStyle w:val="Heading2"/>
       </w:pPr>
+      <w:bookmarkStart w:id="3" w:name="_TocShowcase4"/>
+      <w:bookmarkEnd w:id="3"/>
       <w:r>
         <w:t xml:space="preserve">Spacing</w:t>
       </w:r>
@@ -154,6 +162,8 @@
       <w:pPr>
         <w:pStyle w:val="Heading2"/>
       </w:pPr>
+      <w:bookmarkStart w:id="4" w:name="_TocShowcase5"/>
+      <w:bookmarkEnd w:id="4"/>
       <w:r>
         <w:t xml:space="preserve">Run (Character) Formatting</w:t>
       </w:r>
@@ -709,8 +719,8 @@
     </w:p>
     <w:p>
       <w:pPr/>
-      <w:bookmarkStart w:id="0" w:name="bookmark-demo"/>
-      <w:bookmarkEnd w:id="0"/>
+      <w:bookmarkStart w:id="5" w:name="bookmark-demo"/>
+      <w:bookmarkEnd w:id="5"/>
       <w:r>
         <w:t xml:space="preserve">This paragraph has a named bookmark anchor ('bookmark-demo') at its start.</w:t>
       </w:r>

</xml_diff>

<commit_message>
feat: comprehensive showcase rewrite + tutorial bookmark/TOC steps
- Rewrote generate_showcase.py to demo every feature end-to-end:
  TOC with clickable anchors, paragraph/run formatting, images,
  bullet + numbered lists (3 levels), tables with merged cells,
  hyperlinks (external/mailto/internal), bookmarks, footnotes,
  endnotes, page breaks, page number fields, headers/footers
- BM dict ensures TOC entry URLs always match heading bookmark names
- _ph() helper attaches BookmarkStart to each section heading
- Updated tutorial.md: added steps 11 (Bookmarks) and 12 (TOC)
  with working code examples; renumbered subsequent steps
- Removed TOC and Footnotes from README planned table (both shipped)
- Regenerated showcase.docx + showcase.html fixtures

Co-Authored-By: Claude Sonnet 4.6 <noreply@anthropic.com>
</commit_message>
<xml_diff>
--- a/tests/fixtures/showcase.docx
+++ b/tests/fixtures/showcase.docx
@@ -6,7 +6,7 @@
       <w:pPr>
         <w:pStyle w:val="Heading1"/>
       </w:pPr>
-      <w:bookmarkStart w:id="0" w:name="_TocShowcase1"/>
+      <w:bookmarkStart w:id="0" w:name="showcase-title"/>
       <w:bookmarkEnd w:id="0"/>
       <w:r>
         <w:t xml:space="preserve">docwow Showcase Document</w:t>
@@ -15,25 +15,192 @@
     <w:p>
       <w:pPr/>
       <w:r>
-        <w:t xml:space="preserve">This document is generated entirely by the docwow writer layer. It exercises every feature implemented in the library.</w:t>
+        <w:t xml:space="preserve">This document is generated entirely by the docwow writer layer. It demonstrates every supported feature. Open showcase.html in a browser and showcase.docx in Word to verify that all features render correctly.</w:t>
       </w:r>
     </w:p>
     <w:p>
       <w:pPr>
         <w:pStyle w:val="Heading2"/>
       </w:pPr>
-      <w:bookmarkStart w:id="1" w:name="_TocShowcase2"/>
+      <w:bookmarkStart w:id="1" w:name="showcase-toc"/>
       <w:bookmarkEnd w:id="1"/>
       <w:r>
+        <w:t xml:space="preserve">Table of Contents</w:t>
+      </w:r>
+    </w:p>
+    <w:sdt>
+      <w:sdtPr>
+        <w:tag w:val="Table of Contents"/>
+        <w:docPartObj>
+          <w:docPartGallery w:val="Table of Contents"/>
+          <w:docPartUnique/>
+        </w:docPartObj>
+      </w:sdtPr>
+      <w:sdtContent>
+        <w:p>
+          <w:pPr>
+            <w:pStyle w:val="TOCHeading"/>
+          </w:pPr>
+          <w:r>
+            <w:t xml:space="preserve">Contents</w:t>
+          </w:r>
+        </w:p>
+        <w:p>
+          <w:pPr>
+            <w:pStyle w:val="TOC1"/>
+          </w:pPr>
+          <w:hyperlink w:anchor="showcase-title">
+            <w:r>
+              <w:t xml:space="preserve">docwow Showcase Document</w:t>
+            </w:r>
+          </w:hyperlink>
+        </w:p>
+        <w:p>
+          <w:pPr>
+            <w:pStyle w:val="TOC1"/>
+          </w:pPr>
+          <w:hyperlink w:anchor="showcase-toc">
+            <w:r>
+              <w:t xml:space="preserve">Table of Contents</w:t>
+            </w:r>
+          </w:hyperlink>
+        </w:p>
+        <w:p>
+          <w:pPr>
+            <w:pStyle w:val="TOC1"/>
+          </w:pPr>
+          <w:hyperlink w:anchor="showcase-para-fmt">
+            <w:r>
+              <w:t xml:space="preserve">Paragraph Formatting</w:t>
+            </w:r>
+          </w:hyperlink>
+        </w:p>
+        <w:p>
+          <w:pPr>
+            <w:pStyle w:val="TOC1"/>
+          </w:pPr>
+          <w:hyperlink w:anchor="showcase-run-fmt">
+            <w:r>
+              <w:t xml:space="preserve">Run (Character) Formatting</w:t>
+            </w:r>
+          </w:hyperlink>
+        </w:p>
+        <w:p>
+          <w:pPr>
+            <w:pStyle w:val="TOC1"/>
+          </w:pPr>
+          <w:hyperlink w:anchor="showcase-images">
+            <w:r>
+              <w:t xml:space="preserve">Inline Images</w:t>
+            </w:r>
+          </w:hyperlink>
+        </w:p>
+        <w:p>
+          <w:pPr>
+            <w:pStyle w:val="TOC1"/>
+          </w:pPr>
+          <w:hyperlink w:anchor="showcase-lists">
+            <w:r>
+              <w:t xml:space="preserve">Lists</w:t>
+            </w:r>
+          </w:hyperlink>
+        </w:p>
+        <w:p>
+          <w:pPr>
+            <w:pStyle w:val="TOC1"/>
+          </w:pPr>
+          <w:hyperlink w:anchor="showcase-tables">
+            <w:r>
+              <w:t xml:space="preserve">Tables</w:t>
+            </w:r>
+          </w:hyperlink>
+        </w:p>
+        <w:p>
+          <w:pPr>
+            <w:pStyle w:val="TOC1"/>
+          </w:pPr>
+          <w:hyperlink w:anchor="showcase-hyperlinks">
+            <w:r>
+              <w:t xml:space="preserve">Hyperlinks</w:t>
+            </w:r>
+          </w:hyperlink>
+        </w:p>
+        <w:p>
+          <w:pPr>
+            <w:pStyle w:val="TOC1"/>
+          </w:pPr>
+          <w:hyperlink w:anchor="showcase-bookmarks">
+            <w:r>
+              <w:t xml:space="preserve">Bookmarks</w:t>
+            </w:r>
+          </w:hyperlink>
+        </w:p>
+        <w:p>
+          <w:pPr>
+            <w:pStyle w:val="TOC1"/>
+          </w:pPr>
+          <w:hyperlink w:anchor="showcase-footnotes">
+            <w:r>
+              <w:t xml:space="preserve">Footnotes and Endnotes</w:t>
+            </w:r>
+          </w:hyperlink>
+        </w:p>
+        <w:p>
+          <w:pPr>
+            <w:pStyle w:val="TOC1"/>
+          </w:pPr>
+          <w:hyperlink w:anchor="showcase-pagebreaks">
+            <w:r>
+              <w:t xml:space="preserve">Page Breaks</w:t>
+            </w:r>
+          </w:hyperlink>
+        </w:p>
+        <w:p>
+          <w:pPr>
+            <w:pStyle w:val="TOC1"/>
+          </w:pPr>
+          <w:hyperlink w:anchor="showcase-pagefields">
+            <w:r>
+              <w:t xml:space="preserve">Page Number Fields</w:t>
+            </w:r>
+          </w:hyperlink>
+        </w:p>
+        <w:p>
+          <w:pPr>
+            <w:pStyle w:val="TOC1"/>
+          </w:pPr>
+          <w:hyperlink w:anchor="showcase-hf">
+            <w:r>
+              <w:t xml:space="preserve">Headers and Footers</w:t>
+            </w:r>
+          </w:hyperlink>
+        </w:p>
+      </w:sdtContent>
+    </w:sdt>
+    <w:p>
+      <w:pPr>
+        <w:pStyle w:val="Heading1"/>
+      </w:pPr>
+      <w:bookmarkStart w:id="2" w:name="showcase-para-fmt"/>
+      <w:bookmarkEnd w:id="2"/>
+      <w:r>
         <w:t xml:space="preserve">Paragraph Formatting</w:t>
       </w:r>
     </w:p>
     <w:p>
       <w:pPr>
+        <w:pStyle w:val="Heading2"/>
+      </w:pPr>
+      <w:r>
+        <w:t xml:space="preserve">Alignment</w:t>
+      </w:r>
+    </w:p>
+    <w:p>
+      <w:pPr>
         <w:jc w:val="left"/>
       </w:pPr>
       <w:r>
-        <w:t xml:space="preserve">Left-aligned paragraph (default)</w:t>
+        <w:t xml:space="preserve">Left-aligned paragraph (default).</w:t>
       </w:r>
     </w:p>
     <w:p>
@@ -41,7 +208,7 @@
         <w:jc w:val="center"/>
       </w:pPr>
       <w:r>
-        <w:t xml:space="preserve">Centre-aligned paragraph</w:t>
+        <w:t xml:space="preserve">Centre-aligned paragraph.</w:t>
       </w:r>
     </w:p>
     <w:p>
@@ -49,7 +216,7 @@
         <w:jc w:val="right"/>
       </w:pPr>
       <w:r>
-        <w:t xml:space="preserve">Right-aligned paragraph</w:t>
+        <w:t xml:space="preserve">Right-aligned paragraph.</w:t>
       </w:r>
     </w:p>
     <w:p>
@@ -57,15 +224,13 @@
         <w:jc w:val="both"/>
       </w:pPr>
       <w:r>
-        <w:t xml:space="preserve">Justified paragraph. Lorem ipsum dolor sit amet, consectetur adipiscing elit. Sed do eiusmod tempor incididunt ut labore et dolore.</w:t>
+        <w:t xml:space="preserve">Justified paragraph. Lorem ipsum dolor sit amet, consectetur adipiscing elit. Sed do eiusmod tempor incididunt ut labore et dolore magna aliqua.</w:t>
       </w:r>
     </w:p>
     <w:p>
       <w:pPr>
         <w:pStyle w:val="Heading2"/>
       </w:pPr>
-      <w:bookmarkStart w:id="2" w:name="_TocShowcase3"/>
-      <w:bookmarkEnd w:id="2"/>
       <w:r>
         <w:t xml:space="preserve">Indentation</w:t>
       </w:r>
@@ -73,7 +238,7 @@
     <w:p>
       <w:pPr/>
       <w:r>
-        <w:t xml:space="preserve">Normal paragraph — no indent</w:t>
+        <w:t xml:space="preserve">No indent (normal).</w:t>
       </w:r>
     </w:p>
     <w:p>
@@ -81,7 +246,7 @@
         <w:ind w:left="720"/>
       </w:pPr>
       <w:r>
-        <w:t xml:space="preserve">Left indent 36pt</w:t>
+        <w:t xml:space="preserve">Left indent 36pt.</w:t>
       </w:r>
     </w:p>
     <w:p>
@@ -89,7 +254,7 @@
         <w:ind w:left="1440"/>
       </w:pPr>
       <w:r>
-        <w:t xml:space="preserve">Left indent 72pt</w:t>
+        <w:t xml:space="preserve">Left indent 72pt.</w:t>
       </w:r>
     </w:p>
     <w:p>
@@ -97,7 +262,7 @@
         <w:ind w:right="720"/>
       </w:pPr>
       <w:r>
-        <w:t xml:space="preserve">Right indent 36pt</w:t>
+        <w:t xml:space="preserve">Right indent 36pt.</w:t>
       </w:r>
     </w:p>
     <w:p>
@@ -105,7 +270,7 @@
         <w:ind w:firstLine="720"/>
       </w:pPr>
       <w:r>
-        <w:t xml:space="preserve">First-line indent 36pt</w:t>
+        <w:t xml:space="preserve">First-line indent 36pt.</w:t>
       </w:r>
     </w:p>
     <w:p>
@@ -113,58 +278,86 @@
         <w:ind w:left="1440" w:hanging="720"/>
       </w:pPr>
       <w:r>
-        <w:t xml:space="preserve">Hanging indent 36pt (first line protrudes left)</w:t>
+        <w:t xml:space="preserve">Hanging indent: first line protrudes left by 36pt.</w:t>
       </w:r>
     </w:p>
     <w:p>
       <w:pPr>
         <w:pStyle w:val="Heading2"/>
       </w:pPr>
-      <w:bookmarkStart w:id="3" w:name="_TocShowcase4"/>
+      <w:r>
+        <w:t xml:space="preserve">Spacing</w:t>
+      </w:r>
+    </w:p>
+    <w:p>
+      <w:pPr>
+        <w:spacing w:before="480"/>
+      </w:pPr>
+      <w:r>
+        <w:t xml:space="preserve">Space-before 24pt.</w:t>
+      </w:r>
+    </w:p>
+    <w:p>
+      <w:pPr>
+        <w:spacing w:after="480"/>
+      </w:pPr>
+      <w:r>
+        <w:t xml:space="preserve">Space-after 24pt.</w:t>
+      </w:r>
+    </w:p>
+    <w:p>
+      <w:pPr>
+        <w:spacing w:line="400" w:lineRule="exact"/>
+      </w:pPr>
+      <w:r>
+        <w:t xml:space="preserve">Line-spacing 20pt.</w:t>
+      </w:r>
+    </w:p>
+    <w:p>
+      <w:pPr>
+        <w:pStyle w:val="Heading2"/>
+      </w:pPr>
+      <w:r>
+        <w:t xml:space="preserve">Pagination flags</w:t>
+      </w:r>
+    </w:p>
+    <w:p>
+      <w:pPr>
+        <w:keepLines/>
+      </w:pPr>
+      <w:r>
+        <w:t xml:space="preserve">keep_together=True: Word keeps all lines of this paragraph on the same page.</w:t>
+      </w:r>
+    </w:p>
+    <w:p>
+      <w:pPr>
+        <w:keepNext/>
+      </w:pPr>
+      <w:r>
+        <w:t xml:space="preserve">keep_with_next=True: Word keeps this paragraph on the same page as the one after it.</w:t>
+      </w:r>
+    </w:p>
+    <w:p>
+      <w:pPr/>
+      <w:r>
+        <w:t xml:space="preserve">This paragraph follows the keep_with_next paragraph.</w:t>
+      </w:r>
+    </w:p>
+    <w:p>
+      <w:pPr>
+        <w:pageBreakBefore/>
+      </w:pPr>
+      <w:r>
+        <w:t xml:space="preserve">page_break_before=True: Word starts this paragraph on a new page.</w:t>
+      </w:r>
+    </w:p>
+    <w:p>
+      <w:pPr>
+        <w:pStyle w:val="Heading1"/>
+      </w:pPr>
+      <w:bookmarkStart w:id="3" w:name="showcase-run-fmt"/>
       <w:bookmarkEnd w:id="3"/>
       <w:r>
-        <w:t xml:space="preserve">Spacing</w:t>
-      </w:r>
-    </w:p>
-    <w:p>
-      <w:pPr>
-        <w:spacing w:before="480"/>
-      </w:pPr>
-      <w:r>
-        <w:t xml:space="preserve">Space before 24pt</w:t>
-      </w:r>
-    </w:p>
-    <w:p>
-      <w:pPr>
-        <w:spacing w:after="480"/>
-      </w:pPr>
-      <w:r>
-        <w:t xml:space="preserve">Space after 24pt</w:t>
-      </w:r>
-    </w:p>
-    <w:p>
-      <w:pPr>
-        <w:spacing w:line="400" w:lineRule="exact"/>
-      </w:pPr>
-      <w:r>
-        <w:t xml:space="preserve">Line spacing 20pt</w:t>
-      </w:r>
-    </w:p>
-    <w:p>
-      <w:pPr>
-        <w:pageBreakBefore/>
-      </w:pPr>
-      <w:r>
-        <w:t xml:space="preserve">Page break before this paragraph</w:t>
-      </w:r>
-    </w:p>
-    <w:p>
-      <w:pPr>
-        <w:pStyle w:val="Heading2"/>
-      </w:pPr>
-      <w:bookmarkStart w:id="4" w:name="_TocShowcase5"/>
-      <w:bookmarkEnd w:id="4"/>
-      <w:r>
         <w:t xml:space="preserve">Run (Character) Formatting</w:t>
       </w:r>
     </w:p>
@@ -174,32 +367,32 @@
         <w:rPr>
           <w:b/>
         </w:rPr>
-        <w:t xml:space="preserve">Bold </w:t>
+        <w:t xml:space="preserve">Bold  </w:t>
       </w:r>
       <w:r>
         <w:rPr>
           <w:i/>
         </w:rPr>
-        <w:t xml:space="preserve">Italic </w:t>
+        <w:t xml:space="preserve">Italic  </w:t>
       </w:r>
       <w:r>
         <w:rPr>
           <w:u w:val="single"/>
         </w:rPr>
-        <w:t xml:space="preserve">Underline </w:t>
+        <w:t xml:space="preserve">Underline  </w:t>
       </w:r>
       <w:r>
         <w:rPr>
           <w:strike/>
         </w:rPr>
-        <w:t xml:space="preserve">Strikethrough </w:t>
+        <w:t xml:space="preserve">Strikethrough  </w:t>
       </w:r>
       <w:r>
         <w:rPr>
           <w:b/>
           <w:i/>
         </w:rPr>
-        <w:t xml:space="preserve">Bold+Italic</w:t>
+        <w:t xml:space="preserve">Bold + Italic</w:t>
       </w:r>
     </w:p>
     <w:p>
@@ -209,14 +402,14 @@
           <w:rFonts w:ascii="Arial" w:hAnsi="Arial"/>
           <w:sz w:val="20"/>
         </w:rPr>
-        <w:t xml:space="preserve">Arial 10pt </w:t>
+        <w:t xml:space="preserve">Arial 10pt  </w:t>
       </w:r>
       <w:r>
         <w:rPr>
           <w:rFonts w:ascii="Courier New" w:hAnsi="Courier New"/>
           <w:sz w:val="24"/>
         </w:rPr>
-        <w:t xml:space="preserve">Courier New 12pt </w:t>
+        <w:t xml:space="preserve">Courier New 12pt  </w:t>
       </w:r>
       <w:r>
         <w:rPr>
@@ -232,19 +425,19 @@
         <w:rPr>
           <w:color w:val="FF0000"/>
         </w:rPr>
-        <w:t xml:space="preserve">Red text </w:t>
+        <w:t xml:space="preserve">Red  </w:t>
       </w:r>
       <w:r>
         <w:rPr>
           <w:color w:val="00AA00"/>
         </w:rPr>
-        <w:t xml:space="preserve">Green text </w:t>
+        <w:t xml:space="preserve">Green  </w:t>
       </w:r>
       <w:r>
         <w:rPr>
           <w:color w:val="0000FF"/>
         </w:rPr>
-        <w:t xml:space="preserve">Blue text</w:t>
+        <w:t xml:space="preserve">Blue</w:t>
       </w:r>
     </w:p>
     <w:p>
@@ -253,13 +446,13 @@
         <w:rPr>
           <w:highlight w:val="yellow"/>
         </w:rPr>
-        <w:t xml:space="preserve">Yellow highlight </w:t>
+        <w:t xml:space="preserve">Yellow highlight  </w:t>
       </w:r>
       <w:r>
         <w:rPr>
           <w:highlight w:val="cyan"/>
         </w:rPr>
-        <w:t xml:space="preserve">Cyan highlight </w:t>
+        <w:t xml:space="preserve">Cyan highlight  </w:t>
       </w:r>
       <w:r>
         <w:rPr>
@@ -280,7 +473,7 @@
         <w:t xml:space="preserve">Superscript</w:t>
       </w:r>
       <w:r>
-        <w:t xml:space="preserve"> Normal </w:t>
+        <w:t xml:space="preserve">  Normal  </w:t>
       </w:r>
       <w:r>
         <w:rPr>
@@ -289,7 +482,7 @@
         <w:t xml:space="preserve">Subscript</w:t>
       </w:r>
       <w:r>
-        <w:t xml:space="preserve"> Normal</w:t>
+        <w:t xml:space="preserve">  Normal</w:t>
       </w:r>
     </w:p>
     <w:p>
@@ -297,23 +490,25 @@
       <w:r>
         <w:t xml:space="preserve">Line 1</w:t>
         <w:br/>
-        <w:t xml:space="preserve">Line 2 (newline in same run)</w:t>
+        <w:t xml:space="preserve">Line 2 (newline inside one run)</w:t>
         <w:br/>
         <w:t xml:space="preserve">Line 3</w:t>
       </w:r>
     </w:p>
     <w:p>
       <w:pPr>
-        <w:pStyle w:val="Heading2"/>
-      </w:pPr>
-      <w:r>
-        <w:t xml:space="preserve">Inline Image</w:t>
-      </w:r>
-    </w:p>
-    <w:p>
-      <w:pPr/>
-      <w:r>
-        <w:t xml:space="preserve">The paragraph below contains an inline image (8×8 white PNG):</w:t>
+        <w:pStyle w:val="Heading1"/>
+      </w:pPr>
+      <w:bookmarkStart w:id="4" w:name="showcase-images"/>
+      <w:bookmarkEnd w:id="4"/>
+      <w:r>
+        <w:t xml:space="preserve">Inline Images</w:t>
+      </w:r>
+    </w:p>
+    <w:p>
+      <w:pPr/>
+      <w:r>
+        <w:t xml:space="preserve">A 16×16 4-quadrant PNG embedded as an inline image run:</w:t>
       </w:r>
     </w:p>
     <w:p>
@@ -356,7 +551,17 @@
         </w:drawing>
       </w:r>
       <w:r>
-        <w:t xml:space="preserve"> — After image</w:t>
+        <w:t xml:space="preserve"> — after image.</w:t>
+      </w:r>
+    </w:p>
+    <w:p>
+      <w:pPr>
+        <w:pStyle w:val="Heading1"/>
+      </w:pPr>
+      <w:bookmarkStart w:id="5" w:name="showcase-lists"/>
+      <w:bookmarkEnd w:id="5"/>
+      <w:r>
+        <w:t xml:space="preserve">Lists</w:t>
       </w:r>
     </w:p>
     <w:p>
@@ -364,7 +569,7 @@
         <w:pStyle w:val="Heading2"/>
       </w:pPr>
       <w:r>
-        <w:t xml:space="preserve">Bullet List</w:t>
+        <w:t xml:space="preserve">Bullet list (3 levels):</w:t>
       </w:r>
     </w:p>
     <w:p>
@@ -375,7 +580,7 @@
         </w:numPr>
       </w:pPr>
       <w:r>
-        <w:t xml:space="preserve">First bullet item</w:t>
+        <w:t xml:space="preserve">First bullet</w:t>
       </w:r>
     </w:p>
     <w:p>
@@ -386,7 +591,7 @@
         </w:numPr>
       </w:pPr>
       <w:r>
-        <w:t xml:space="preserve">Second bullet item</w:t>
+        <w:t xml:space="preserve">Second bullet</w:t>
       </w:r>
     </w:p>
     <w:p>
@@ -397,7 +602,7 @@
         </w:numPr>
       </w:pPr>
       <w:r>
-        <w:t xml:space="preserve">Third bullet item</w:t>
+        <w:t xml:space="preserve">Third bullet</w:t>
       </w:r>
     </w:p>
     <w:p>
@@ -408,7 +613,7 @@
         </w:numPr>
       </w:pPr>
       <w:r>
-        <w:t xml:space="preserve">Nested level 1</w:t>
+        <w:t xml:space="preserve">Nested level 1 — first</w:t>
       </w:r>
     </w:p>
     <w:p>
@@ -419,7 +624,7 @@
         </w:numPr>
       </w:pPr>
       <w:r>
-        <w:t xml:space="preserve">Nested level 1 second item</w:t>
+        <w:t xml:space="preserve">Nested level 1 — second</w:t>
       </w:r>
     </w:p>
     <w:p>
@@ -449,7 +654,7 @@
         <w:pStyle w:val="Heading2"/>
       </w:pPr>
       <w:r>
-        <w:t xml:space="preserve">Numbered List</w:t>
+        <w:t xml:space="preserve">Numbered list:</w:t>
       </w:r>
     </w:p>
     <w:p>
@@ -460,7 +665,7 @@
         </w:numPr>
       </w:pPr>
       <w:r>
-        <w:t xml:space="preserve">First numbered item</w:t>
+        <w:t xml:space="preserve">First item</w:t>
       </w:r>
     </w:p>
     <w:p>
@@ -471,7 +676,7 @@
         </w:numPr>
       </w:pPr>
       <w:r>
-        <w:t xml:space="preserve">Second numbered item</w:t>
+        <w:t xml:space="preserve">Second item</w:t>
       </w:r>
     </w:p>
     <w:p>
@@ -482,15 +687,23 @@
         </w:numPr>
       </w:pPr>
       <w:r>
-        <w:t xml:space="preserve">Third numbered item</w:t>
-      </w:r>
-    </w:p>
-    <w:p>
-      <w:pPr>
-        <w:pStyle w:val="Heading2"/>
-      </w:pPr>
-      <w:r>
-        <w:t xml:space="preserve">Table</w:t>
+        <w:t xml:space="preserve">Third item</w:t>
+      </w:r>
+    </w:p>
+    <w:p>
+      <w:pPr>
+        <w:pStyle w:val="Heading1"/>
+      </w:pPr>
+      <w:bookmarkStart w:id="6" w:name="showcase-tables"/>
+      <w:bookmarkEnd w:id="6"/>
+      <w:r>
+        <w:t xml:space="preserve">Tables</w:t>
+      </w:r>
+    </w:p>
+    <w:p>
+      <w:pPr/>
+      <w:r>
+        <w:t xml:space="preserve">3-column table with colspan and rowspan:</w:t>
       </w:r>
     </w:p>
     <w:tbl>
@@ -551,7 +764,7 @@
           <w:p>
             <w:pPr/>
             <w:r>
-              <w:t xml:space="preserve">Row 1, Col 1</w:t>
+              <w:t xml:space="preserve">Row 1 Col 1</w:t>
             </w:r>
           </w:p>
         </w:tc>
@@ -560,7 +773,7 @@
           <w:p>
             <w:pPr/>
             <w:r>
-              <w:t xml:space="preserve">Row 1, Col 2</w:t>
+              <w:t xml:space="preserve">Row 1 Col 2</w:t>
             </w:r>
           </w:p>
         </w:tc>
@@ -569,7 +782,7 @@
           <w:p>
             <w:pPr/>
             <w:r>
-              <w:t xml:space="preserve">Row 1, Col 3</w:t>
+              <w:t xml:space="preserve">Row 1 Col 3</w:t>
             </w:r>
           </w:p>
         </w:tc>
@@ -582,7 +795,7 @@
           <w:p>
             <w:pPr/>
             <w:r>
-              <w:t xml:space="preserve">Colspan 2</w:t>
+              <w:t xml:space="preserve">colspan=2</w:t>
             </w:r>
           </w:p>
         </w:tc>
@@ -604,7 +817,7 @@
           <w:p>
             <w:pPr/>
             <w:r>
-              <w:t xml:space="preserve">Row span start</w:t>
+              <w:t xml:space="preserve">rowspan start</w:t>
             </w:r>
           </w:p>
         </w:tc>
@@ -658,11 +871,44 @@
           </w:p>
         </w:tc>
       </w:tr>
+      <w:tr>
+        <w:tc>
+          <w:tcPr>
+            <w:tcW w:w="2400" w:type="dxa"/>
+          </w:tcPr>
+          <w:p>
+            <w:pPr/>
+            <w:r>
+              <w:t xml:space="preserve">Row span start</w:t>
+            </w:r>
+          </w:p>
+        </w:tc>
+        <w:tc>
+          <w:tcPr/>
+          <w:p>
+            <w:pPr/>
+            <w:r>
+              <w:t xml:space="preserve">Row 5 Col 2</w:t>
+            </w:r>
+          </w:p>
+        </w:tc>
+        <w:tc>
+          <w:tcPr/>
+          <w:p>
+            <w:pPr/>
+            <w:r>
+              <w:t xml:space="preserve">Row 5 Col 3</w:t>
+            </w:r>
+          </w:p>
+        </w:tc>
+      </w:tr>
     </w:tbl>
     <w:p>
       <w:pPr>
-        <w:pStyle w:val="Heading2"/>
-      </w:pPr>
+        <w:pStyle w:val="Heading1"/>
+      </w:pPr>
+      <w:bookmarkStart w:id="7" w:name="showcase-hyperlinks"/>
+      <w:bookmarkEnd w:id="7"/>
       <w:r>
         <w:t xml:space="preserve">Hyperlinks</w:t>
       </w:r>
@@ -670,7 +916,7 @@
     <w:p>
       <w:pPr/>
       <w:r>
-        <w:t xml:space="preserve">Visit the </w:t>
+        <w:t xml:space="preserve">External URL: </w:t>
       </w:r>
       <w:hyperlink r:id="rId5">
         <w:r>
@@ -678,13 +924,13 @@
         </w:r>
       </w:hyperlink>
       <w:r>
-        <w:t xml:space="preserve"> for full details.</w:t>
-      </w:r>
-    </w:p>
-    <w:p>
-      <w:pPr/>
-      <w:r>
-        <w:t xml:space="preserve">Report bugs on </w:t>
+        <w:t xml:space="preserve">.</w:t>
+      </w:r>
+    </w:p>
+    <w:p>
+      <w:pPr/>
+      <w:r>
+        <w:t xml:space="preserve">Bug reports: </w:t>
       </w:r>
       <w:hyperlink r:id="rId6">
         <w:r>
@@ -698,7 +944,7 @@
     <w:p>
       <w:pPr/>
       <w:r>
-        <w:t xml:space="preserve">Contact us at </w:t>
+        <w:t xml:space="preserve">Mailto: </w:t>
       </w:r>
       <w:hyperlink r:id="rId7">
         <w:r>
@@ -710,25 +956,41 @@
       </w:r>
     </w:p>
     <w:p>
-      <w:pPr>
-        <w:pStyle w:val="Heading2"/>
-      </w:pPr>
+      <w:pPr/>
+      <w:r>
+        <w:t xml:space="preserve">Internal anchor: </w:t>
+      </w:r>
+      <w:hyperlink w:anchor="showcase-bookmarks">
+        <w:r>
+          <w:t xml:space="preserve">jump to Bookmarks section</w:t>
+        </w:r>
+      </w:hyperlink>
+      <w:r>
+        <w:t xml:space="preserve"> (should scroll to the Bookmarks heading above).</w:t>
+      </w:r>
+    </w:p>
+    <w:p>
+      <w:pPr>
+        <w:pStyle w:val="Heading1"/>
+      </w:pPr>
+      <w:bookmarkStart w:id="8" w:name="showcase-bookmarks"/>
+      <w:bookmarkEnd w:id="8"/>
       <w:r>
         <w:t xml:space="preserve">Bookmarks</w:t>
       </w:r>
     </w:p>
     <w:p>
       <w:pPr/>
-      <w:bookmarkStart w:id="5" w:name="bookmark-demo"/>
-      <w:bookmarkEnd w:id="5"/>
-      <w:r>
-        <w:t xml:space="preserve">This paragraph has a named bookmark anchor ('bookmark-demo') at its start.</w:t>
-      </w:r>
-    </w:p>
-    <w:p>
-      <w:pPr/>
-      <w:r>
-        <w:t xml:space="preserve">This hyperlink jumps to the bookmark above: </w:t>
+      <w:bookmarkStart w:id="9" w:name="bookmark-demo"/>
+      <w:bookmarkEnd w:id="9"/>
+      <w:r>
+        <w:t xml:space="preserve">This paragraph carries the named bookmark anchor 'bookmark-demo'. The anchor is a zero-width invisible marker.</w:t>
+      </w:r>
+    </w:p>
+    <w:p>
+      <w:pPr/>
+      <w:r>
+        <w:t xml:space="preserve">This hyperlink jumps to the anchor above: </w:t>
       </w:r>
       <w:hyperlink w:anchor="bookmark-demo">
         <w:r>
@@ -740,9 +1002,17 @@
       </w:r>
     </w:p>
     <w:p>
-      <w:pPr>
-        <w:pStyle w:val="Heading2"/>
-      </w:pPr>
+      <w:pPr/>
+      <w:r>
+        <w:t xml:space="preserve">The TOC at the top of this document also uses bookmarks — each section heading carries a BookmarkStart run that the TOC hyperlinks resolve to.</w:t>
+      </w:r>
+    </w:p>
+    <w:p>
+      <w:pPr>
+        <w:pStyle w:val="Heading1"/>
+      </w:pPr>
+      <w:bookmarkStart w:id="10" w:name="showcase-footnotes"/>
+      <w:bookmarkEnd w:id="10"/>
       <w:r>
         <w:t xml:space="preserve">Footnotes and Endnotes</w:t>
       </w:r>
@@ -787,97 +1057,104 @@
       </w:r>
     </w:p>
     <w:p>
+      <w:pPr>
+        <w:pStyle w:val="Heading1"/>
+      </w:pPr>
+      <w:bookmarkStart w:id="11" w:name="showcase-pagebreaks"/>
+      <w:bookmarkEnd w:id="11"/>
+      <w:r>
+        <w:t xml:space="preserve">Page Breaks</w:t>
+      </w:r>
+    </w:p>
+    <w:p>
+      <w:pPr/>
+      <w:r>
+        <w:t xml:space="preserve">An explicit page break element follows. In HTML it renders as &lt;div class="dw-page-break"&gt; (invisible, preserved for round-trip). In Word / LibreOffice it forces a new page.</w:t>
+      </w:r>
+    </w:p>
+    <w:p>
       <w:r>
         <w:br w:type="page"/>
       </w:r>
     </w:p>
     <w:p>
-      <w:pPr>
-        <w:pStyle w:val="Heading2"/>
-      </w:pPr>
-      <w:r>
-        <w:t xml:space="preserve">Table of Contents</w:t>
-      </w:r>
-    </w:p>
-    <w:p>
-      <w:pPr/>
-      <w:r>
-        <w:t xml:space="preserve">The block below is a structured document tag (w:sdt) TOC:</w:t>
-      </w:r>
-    </w:p>
-    <w:sdt>
-      <w:sdtPr>
-        <w:tag w:val="Table of Contents"/>
-        <w:docPartObj>
-          <w:docPartGallery w:val="Table of Contents"/>
-          <w:docPartUnique/>
-        </w:docPartObj>
-      </w:sdtPr>
-      <w:sdtContent>
-        <w:p>
-          <w:pPr>
-            <w:pStyle w:val="TOCHeading"/>
-          </w:pPr>
-          <w:r>
-            <w:t xml:space="preserve">Contents</w:t>
-          </w:r>
-        </w:p>
-        <w:p>
-          <w:pPr>
-            <w:pStyle w:val="TOC1"/>
-          </w:pPr>
-          <w:hyperlink w:anchor="_TocShowcase1">
-            <w:r>
-              <w:t xml:space="preserve">Plain paragraphs</w:t>
-            </w:r>
-          </w:hyperlink>
-        </w:p>
-        <w:p>
-          <w:pPr>
-            <w:pStyle w:val="TOC1"/>
-          </w:pPr>
-          <w:hyperlink w:anchor="_TocShowcase2">
-            <w:r>
-              <w:t xml:space="preserve">Paragraph Formatting</w:t>
-            </w:r>
-          </w:hyperlink>
-        </w:p>
-        <w:p>
-          <w:pPr>
-            <w:pStyle w:val="TOC2"/>
-          </w:pPr>
-          <w:hyperlink w:anchor="_TocShowcase3">
-            <w:r>
-              <w:t xml:space="preserve">Indentation</w:t>
-            </w:r>
-          </w:hyperlink>
-        </w:p>
-        <w:p>
-          <w:pPr>
-            <w:pStyle w:val="TOC2"/>
-          </w:pPr>
-          <w:hyperlink w:anchor="_TocShowcase4">
-            <w:r>
-              <w:t xml:space="preserve">Spacing</w:t>
-            </w:r>
-          </w:hyperlink>
-        </w:p>
-        <w:p>
-          <w:pPr>
-            <w:pStyle w:val="TOC1"/>
-          </w:pPr>
-          <w:hyperlink w:anchor="_TocShowcase5">
-            <w:r>
-              <w:t xml:space="preserve">Run (Character) Formatting</w:t>
-            </w:r>
-          </w:hyperlink>
-        </w:p>
-      </w:sdtContent>
-    </w:sdt>
-    <w:p>
-      <w:pPr>
-        <w:pStyle w:val="Heading2"/>
-      </w:pPr>
+      <w:pPr/>
+      <w:r>
+        <w:t xml:space="preserve">This paragraph is immediately after the explicit page break. In Word it should appear at the top of a new page.</w:t>
+      </w:r>
+    </w:p>
+    <w:p>
+      <w:pPr>
+        <w:pStyle w:val="Heading1"/>
+      </w:pPr>
+      <w:bookmarkStart w:id="12" w:name="showcase-pagefields"/>
+      <w:bookmarkEnd w:id="12"/>
+      <w:r>
+        <w:t xml:space="preserve">Page Number Fields</w:t>
+      </w:r>
+    </w:p>
+    <w:p>
+      <w:pPr/>
+      <w:r>
+        <w:t xml:space="preserve">Page number fields can appear anywhere in the body, not just headers/footers. The paragraph below uses PAGE and NUMPAGES fields:</w:t>
+      </w:r>
+    </w:p>
+    <w:p>
+      <w:pPr>
+        <w:jc w:val="center"/>
+      </w:pPr>
+      <w:r>
+        <w:t xml:space="preserve">You are on page </w:t>
+      </w:r>
+      <w:r>
+        <w:fldChar w:fldCharType="begin"/>
+      </w:r>
+      <w:r>
+        <w:instrText xml:space="preserve"> PAGE </w:instrText>
+      </w:r>
+      <w:r>
+        <w:fldChar w:fldCharType="separate"/>
+      </w:r>
+      <w:r>
+        <w:t>1</w:t>
+      </w:r>
+      <w:r>
+        <w:fldChar w:fldCharType="end"/>
+      </w:r>
+      <w:r>
+        <w:t xml:space="preserve"> of </w:t>
+      </w:r>
+      <w:r>
+        <w:fldChar w:fldCharType="begin"/>
+      </w:r>
+      <w:r>
+        <w:instrText xml:space="preserve"> NUMPAGES </w:instrText>
+      </w:r>
+      <w:r>
+        <w:fldChar w:fldCharType="separate"/>
+      </w:r>
+      <w:r>
+        <w:t>1</w:t>
+      </w:r>
+      <w:r>
+        <w:fldChar w:fldCharType="end"/>
+      </w:r>
+      <w:r>
+        <w:t xml:space="preserve"> total pages.</w:t>
+      </w:r>
+    </w:p>
+    <w:p>
+      <w:pPr/>
+      <w:r>
+        <w:t xml:space="preserve">In HTML these render as &lt;span class="dw-field" data-dw-field="PAGE"&gt;1&lt;/span&gt; placeholders (static). In Word they update to the actual page number.</w:t>
+      </w:r>
+    </w:p>
+    <w:p>
+      <w:pPr>
+        <w:pStyle w:val="Heading1"/>
+      </w:pPr>
+      <w:bookmarkStart w:id="13" w:name="showcase-hf"/>
+      <w:bookmarkEnd w:id="13"/>
       <w:r>
         <w:t xml:space="preserve">Headers and Footers</w:t>
       </w:r>
@@ -885,90 +1162,13 @@
     <w:p>
       <w:pPr/>
       <w:r>
-        <w:t xml:space="preserve">This document has a default header and footer with page numbers.</w:t>
-      </w:r>
-    </w:p>
-    <w:p>
-      <w:pPr/>
-      <w:r>
-        <w:t xml:space="preserve">The header shows the document title; the footer shows 'Page N of M'.</w:t>
-      </w:r>
-    </w:p>
-    <w:p>
-      <w:pPr>
-        <w:pStyle w:val="Heading2"/>
-      </w:pPr>
-      <w:r>
-        <w:t xml:space="preserve">Mixed Content</w:t>
-      </w:r>
-    </w:p>
-    <w:p>
-      <w:pPr/>
-      <w:r>
-        <w:t xml:space="preserve">A paragraph before a table.</w:t>
-      </w:r>
-    </w:p>
-    <w:tbl>
-      <w:tblPr>
-        <w:tblW w:w="4000" w:type="dxa"/>
-        <w:tblBorders>
-          <w:top w:val="single" w:sz="4" w:space="0" w:color="auto"/>
-          <w:left w:val="single" w:sz="4" w:space="0" w:color="auto"/>
-          <w:bottom w:val="single" w:sz="4" w:space="0" w:color="auto"/>
-          <w:right w:val="single" w:sz="4" w:space="0" w:color="auto"/>
-          <w:insideH w:val="single" w:sz="4" w:space="0" w:color="auto"/>
-          <w:insideV w:val="single" w:sz="4" w:space="0" w:color="auto"/>
-        </w:tblBorders>
-      </w:tblPr>
-      <w:tblGrid>
-        <w:gridCol w:w="4000"/>
-      </w:tblGrid>
-      <w:tr>
-        <w:tc>
-          <w:tcPr>
-            <w:tcW w:w="4000" w:type="dxa"/>
-          </w:tcPr>
-          <w:p>
-            <w:pPr/>
-            <w:r>
-              <w:t xml:space="preserve">Inside table</w:t>
-            </w:r>
-          </w:p>
-        </w:tc>
-      </w:tr>
-    </w:tbl>
-    <w:p>
-      <w:pPr/>
-      <w:r>
-        <w:t xml:space="preserve">A paragraph after the table.</w:t>
-      </w:r>
-    </w:p>
-    <w:p>
-      <w:pPr>
-        <w:numPr>
-          <w:ilvl w:val="0"/>
-          <w:numId w:val="3"/>
-        </w:numPr>
-      </w:pPr>
-      <w:r>
-        <w:t xml:space="preserve">List after table item 1</w:t>
-      </w:r>
-    </w:p>
-    <w:p>
-      <w:pPr>
-        <w:numPr>
-          <w:ilvl w:val="0"/>
-          <w:numId w:val="3"/>
-        </w:numPr>
-      </w:pPr>
-      <w:r>
-        <w:t xml:space="preserve">List after table item 2</w:t>
-      </w:r>
-    </w:p>
-    <w:p>
-      <w:pPr/>
-      <w:r>
-        <w:t xml:space="preserve">Normal paragraph after list.</w:t>
+        <w:t xml:space="preserve">This document has a default header and footer defined at the Document level. The header (top of each page in Word) shows the document title in italics. The footer (bottom of each page) shows 'Page N of M'.</w:t>
+      </w:r>
+    </w:p>
+    <w:p>
+      <w:pPr/>
+      <w:r>
+        <w:t xml:space="preserve">In HTML, headers and footers are rendered as &lt;header&gt; and &lt;footer&gt; elements. Page-number-only footer paragraphs are hidden (display:none) in the browser but survive the HTML → DOCX round-trip so Word can display the correct values.</w:t>
       </w:r>
     </w:p>
     <w:sectPr>
@@ -1009,7 +1209,7 @@
         <w:endnoteRef/>
       </w:r>
       <w:r>
-        <w:t xml:space="preserve">This is an endnote. It appears at the end of the document.</w:t>
+        <w:t xml:space="preserve">Endnote body — rendered at the very end of the document in Word.</w:t>
       </w:r>
     </w:p>
   </w:endnote>
@@ -1019,7 +1219,9 @@
 <file path=word/footer2.xml><?xml version="1.0" encoding="utf-8"?>
 <w:ftr xmlns:w="http://schemas.openxmlformats.org/wordprocessingml/2006/main" xmlns:r="http://schemas.openxmlformats.org/officeDocument/2006/relationships" xmlns:wp="http://schemas.openxmlformats.org/drawingml/2006/wordprocessingDrawing" xmlns:a="http://schemas.openxmlformats.org/drawingml/2006/main" xmlns:pic="http://schemas.openxmlformats.org/drawingml/2006/picture">
   <w:p>
-    <w:pPr/>
+    <w:pPr>
+      <w:jc w:val="center"/>
+    </w:pPr>
     <w:r>
       <w:t xml:space="preserve">Page </w:t>
     </w:r>
@@ -1088,7 +1290,7 @@
         <w:footnoteRef/>
       </w:r>
       <w:r>
-        <w:t xml:space="preserve">This is the first footnote. It demonstrates the footnote body.</w:t>
+        <w:t xml:space="preserve">First footnote body — rendered at the bottom of the page in Word.</w:t>
       </w:r>
     </w:p>
   </w:footnote>
@@ -1104,7 +1306,7 @@
         <w:footnoteRef/>
       </w:r>
       <w:r>
-        <w:t xml:space="preserve">Second footnote — attached to the second sentence.</w:t>
+        <w:t xml:space="preserve">Second footnote body — attached to the second sentence.</w:t>
       </w:r>
     </w:p>
   </w:footnote>
@@ -1119,7 +1321,7 @@
       <w:rPr>
         <w:i/>
       </w:rPr>
-      <w:t xml:space="preserve">docwow showcase document</w:t>
+      <w:t xml:space="preserve">docwow Showcase Document</w:t>
     </w:r>
   </w:p>
 </w:hdr>

</xml_diff>

<commit_message>
feat: add track changes (w:ins / w:del) across all pipeline layers
Parses w:ins and w:del from DOCX (using w:delText for deletions),
renders as <ins class="dw-ins"> / <del class="dw-del"> in HTML with
data-dw-author, data-dw-date, data-dw-change-id attributes, and writes
back to valid OOXML on round-trip. Adds MutableTrackedChange API with
RunCollection.add_insertion() / add_deletion() factory methods.

56 new tests across models, parser, renderer, html_parser, writer, and api.
Docs updated: README, index, tutorial, open-api, api-classes, showcase.

Co-Authored-By: Claude Sonnet 4.6 <noreply@anthropic.com>
</commit_message>
<xml_diff>
--- a/tests/fixtures/showcase.docx
+++ b/tests/fixtures/showcase.docx
@@ -152,6 +152,16 @@
           <w:hyperlink w:anchor="showcase-comments">
             <w:r>
               <w:t xml:space="preserve">Comments</w:t>
+            </w:r>
+          </w:hyperlink>
+        </w:p>
+        <w:p>
+          <w:pPr>
+            <w:pStyle w:val="TOC1"/>
+          </w:pPr>
+          <w:hyperlink w:anchor="showcase-track-changes">
+            <w:r>
+              <w:t xml:space="preserve">Track Changes</w:t>
             </w:r>
           </w:hyperlink>
         </w:p>
@@ -1120,9 +1130,63 @@
       <w:pPr>
         <w:pStyle w:val="Heading1"/>
       </w:pPr>
-      <w:bookmarkStart w:id="12" w:name="showcase-pagebreaks"/>
+      <w:bookmarkStart w:id="12" w:name="showcase-track-changes"/>
       <w:bookmarkEnd w:id="12"/>
       <w:r>
+        <w:t xml:space="preserve">Track Changes</w:t>
+      </w:r>
+    </w:p>
+    <w:p>
+      <w:pPr/>
+      <w:r>
+        <w:t xml:space="preserve">Track changes records insertions and deletions made by reviewers. In HTML, insertions render as green underlined text and deletions as red strikethrough text. In DOCX they appear in Word's review pane.</w:t>
+      </w:r>
+    </w:p>
+    <w:p>
+      <w:pPr/>
+      <w:r>
+        <w:t xml:space="preserve">The original revenue figure was </w:t>
+      </w:r>
+      <w:del w:id="10" w:author="Alice" w:date="2026-04-17T09:00:00Z">
+        <w:r>
+          <w:delText xml:space="preserve">$3.8 M</w:delText>
+        </w:r>
+      </w:del>
+      <w:ins w:id="11" w:author="Alice" w:date="2026-04-17T09:00:00Z">
+        <w:r>
+          <w:t xml:space="preserve">$4.2 M</w:t>
+        </w:r>
+      </w:ins>
+      <w:r>
+        <w:t xml:space="preserve"> for the quarter.</w:t>
+      </w:r>
+    </w:p>
+    <w:p>
+      <w:pPr/>
+      <w:r>
+        <w:t xml:space="preserve">Please </w:t>
+      </w:r>
+      <w:del w:id="12" w:author="Bob" w:date="2026-04-17T10:00:00Z">
+        <w:r>
+          <w:delText xml:space="preserve">review</w:delText>
+        </w:r>
+      </w:del>
+      <w:ins w:id="13" w:author="Bob" w:date="2026-04-17T10:00:00Z">
+        <w:r>
+          <w:t xml:space="preserve">approve</w:t>
+        </w:r>
+      </w:ins>
+      <w:r>
+        <w:t xml:space="preserve"> this change before the deadline.</w:t>
+      </w:r>
+    </w:p>
+    <w:p>
+      <w:pPr>
+        <w:pStyle w:val="Heading1"/>
+      </w:pPr>
+      <w:bookmarkStart w:id="13" w:name="showcase-pagebreaks"/>
+      <w:bookmarkEnd w:id="13"/>
+      <w:r>
         <w:t xml:space="preserve">Page Breaks</w:t>
       </w:r>
     </w:p>
@@ -1147,8 +1211,8 @@
       <w:pPr>
         <w:pStyle w:val="Heading1"/>
       </w:pPr>
-      <w:bookmarkStart w:id="13" w:name="showcase-pagefields"/>
-      <w:bookmarkEnd w:id="13"/>
+      <w:bookmarkStart w:id="14" w:name="showcase-pagefields"/>
+      <w:bookmarkEnd w:id="14"/>
       <w:r>
         <w:t xml:space="preserve">Page Number Fields</w:t>
       </w:r>
@@ -1213,8 +1277,8 @@
       <w:pPr>
         <w:pStyle w:val="Heading1"/>
       </w:pPr>
-      <w:bookmarkStart w:id="14" w:name="showcase-hf"/>
-      <w:bookmarkEnd w:id="14"/>
+      <w:bookmarkStart w:id="15" w:name="showcase-hf"/>
+      <w:bookmarkEnd w:id="15"/>
       <w:r>
         <w:t xml:space="preserve">Headers and Footers</w:t>
       </w:r>

</xml_diff>

<commit_message>
feat: add paragraph and table cell background shading
Implements solid background shading (w:shd) across all 5 pipeline layers:
- Models: shading field on ParagraphFormatting and TableCell
- Parser: reads w:shd[@w:fill] from pPr and tcPr
- Renderer: emits data-dw-shading and inline background-color CSS
- HTML parser: reads data-dw-shading back for round-trip fidelity
- Writer: writes <w:shd w:val="clear" w:color="auto" w:fill="..."/>
- API: shading property + set_shading() on MutableParagraph and MutableTableCell
- Tests: 44 new tests covering all layers, parser, and full round-trip
- Docs: data-attributes.md and open-api.md updated; showcase extended

Co-Authored-By: Claude Sonnet 4.6 <noreply@anthropic.com>
</commit_message>
<xml_diff>
--- a/tests/fixtures/showcase.docx
+++ b/tests/fixtures/showcase.docx
@@ -162,6 +162,16 @@
           <w:hyperlink w:anchor="showcase-track-changes">
             <w:r>
               <w:t xml:space="preserve">Track Changes</w:t>
+            </w:r>
+          </w:hyperlink>
+        </w:p>
+        <w:p>
+          <w:pPr>
+            <w:pStyle w:val="TOC1"/>
+          </w:pPr>
+          <w:hyperlink w:anchor="showcase-shading">
+            <w:r>
+              <w:t xml:space="preserve">Shading</w:t>
             </w:r>
           </w:hyperlink>
         </w:p>
@@ -1277,8 +1287,98 @@
       <w:pPr>
         <w:pStyle w:val="Heading1"/>
       </w:pPr>
-      <w:bookmarkStart w:id="15" w:name="showcase-hf"/>
+      <w:bookmarkStart w:id="15" w:name="showcase-shading"/>
       <w:bookmarkEnd w:id="15"/>
+      <w:r>
+        <w:t xml:space="preserve">Shading</w:t>
+      </w:r>
+    </w:p>
+    <w:p>
+      <w:pPr/>
+      <w:r>
+        <w:t xml:space="preserve">Paragraph and table cell shading sets a solid background color. The three paragraphs below show blue, orange, and no shading.</w:t>
+      </w:r>
+    </w:p>
+    <w:p>
+      <w:pPr>
+        <w:shd w:val="clear" w:color="auto" w:fill="4472C4"/>
+      </w:pPr>
+      <w:r>
+        <w:t xml:space="preserve">Blue shaded paragraph (4472C4)</w:t>
+      </w:r>
+    </w:p>
+    <w:p>
+      <w:pPr>
+        <w:shd w:val="clear" w:color="auto" w:fill="ED7D31"/>
+      </w:pPr>
+      <w:r>
+        <w:t xml:space="preserve">Orange shaded paragraph (ED7D31)</w:t>
+      </w:r>
+    </w:p>
+    <w:p>
+      <w:pPr/>
+      <w:r>
+        <w:t xml:space="preserve">No shading (plain paragraph)</w:t>
+      </w:r>
+    </w:p>
+    <w:p>
+      <w:pPr/>
+      <w:r>
+        <w:t xml:space="preserve">Table with shaded cells:</w:t>
+      </w:r>
+    </w:p>
+    <w:tbl>
+      <w:tblPr>
+        <w:tblW w:w="9000" w:type="dxa"/>
+        <w:tblBorders>
+          <w:top w:val="single" w:sz="4" w:space="0" w:color="auto"/>
+          <w:left w:val="single" w:sz="4" w:space="0" w:color="auto"/>
+          <w:bottom w:val="single" w:sz="4" w:space="0" w:color="auto"/>
+          <w:right w:val="single" w:sz="4" w:space="0" w:color="auto"/>
+          <w:insideH w:val="single" w:sz="4" w:space="0" w:color="auto"/>
+          <w:insideV w:val="single" w:sz="4" w:space="0" w:color="auto"/>
+        </w:tblBorders>
+      </w:tblPr>
+      <w:tr>
+        <w:tc>
+          <w:tcPr>
+            <w:shd w:val="clear" w:color="auto" w:fill="4472C4"/>
+          </w:tcPr>
+          <w:p>
+            <w:pPr/>
+            <w:r>
+              <w:t xml:space="preserve">Blue cell</w:t>
+            </w:r>
+          </w:p>
+        </w:tc>
+        <w:tc>
+          <w:tcPr>
+            <w:shd w:val="clear" w:color="auto" w:fill="ED7D31"/>
+          </w:tcPr>
+          <w:p>
+            <w:pPr/>
+            <w:r>
+              <w:t xml:space="preserve">Orange cell</w:t>
+            </w:r>
+          </w:p>
+        </w:tc>
+        <w:tc>
+          <w:tcPr/>
+          <w:p>
+            <w:pPr/>
+            <w:r>
+              <w:t xml:space="preserve">Plain cell</w:t>
+            </w:r>
+          </w:p>
+        </w:tc>
+      </w:tr>
+    </w:tbl>
+    <w:p>
+      <w:pPr>
+        <w:pStyle w:val="Heading1"/>
+      </w:pPr>
+      <w:bookmarkStart w:id="16" w:name="showcase-hf"/>
+      <w:bookmarkEnd w:id="16"/>
       <w:r>
         <w:t xml:space="preserve">Headers and Footers</w:t>
       </w:r>

</xml_diff>

<commit_message>
feat: add character style support (w:rStyle)
Implements named Word character styles across all 5 pipeline layers:
- Models: char_style_id field on RunFormatting
- Parser: reads w:rStyle[@w:val] from w:rPr
- Renderer: emits data-dw-char-style and dw-cstyle-{id} CSS class on spans
- CSS generator: emits .dw-cstyle-* rules for character styles (not .dw-style-*)
- HTML parser: reads data-dw-char-style back for round-trip fidelity
- Writer: writes <w:rStyle w:val="..."/> as first child of w:rPr
- API: char_style_id property + set_char_style() on MutableRun; add_text() accepts char_style_id
- Tests: 30 new tests covering all layers + parser fixture + full round-trip
- Docs: data-attributes.md, css-classes.md, open-api.md updated; showcase extended

Co-Authored-By: Claude Sonnet 4.6 <noreply@anthropic.com>
</commit_message>
<xml_diff>
--- a/tests/fixtures/showcase.docx
+++ b/tests/fixtures/showcase.docx
@@ -523,6 +523,30 @@
         <w:t xml:space="preserve">Line 2 (newline inside one run)</w:t>
         <w:br/>
         <w:t xml:space="preserve">Line 3</w:t>
+      </w:r>
+    </w:p>
+    <w:p>
+      <w:pPr/>
+      <w:r>
+        <w:t xml:space="preserve">Plain  </w:t>
+      </w:r>
+      <w:r>
+        <w:rPr>
+          <w:rStyle w:val="Strong"/>
+        </w:rPr>
+        <w:t xml:space="preserve">Strong  </w:t>
+      </w:r>
+      <w:r>
+        <w:rPr>
+          <w:rStyle w:val="Emphasis"/>
+        </w:rPr>
+        <w:t xml:space="preserve">Emphasis  </w:t>
+      </w:r>
+      <w:r>
+        <w:rPr>
+          <w:rStyle w:val="SubtleEmphasis"/>
+        </w:rPr>
+        <w:t xml:space="preserve">Subtle Emphasis</w:t>
       </w:r>
     </w:p>
     <w:p>
@@ -1689,5 +1713,24 @@
       <w:sz w:val="28"/>
     </w:rPr>
   </w:style>
+  <w:style w:type="character" w:styleId="Strong">
+    <w:name w:val="Strong"/>
+    <w:rPr>
+      <w:b/>
+    </w:rPr>
+  </w:style>
+  <w:style w:type="character" w:styleId="Emphasis">
+    <w:name w:val="Emphasis"/>
+    <w:rPr>
+      <w:i/>
+    </w:rPr>
+  </w:style>
+  <w:style w:type="character" w:styleId="SubtleEmphasis">
+    <w:name w:val="Subtle Emphasis"/>
+    <w:rPr>
+      <w:i/>
+      <w:color w:val="808080"/>
+    </w:rPr>
+  </w:style>
 </w:styles>
 </file>
</xml_diff>

<commit_message>
feat: add small-caps and all-caps run formatting (w:smallCaps, w:caps)
Implements w:smallCaps and w:caps across all pipeline layers: parser,
renderer (font-variant:small-caps / text-transform:uppercase CSS),
HTML parser, writer, and mutable API (set_small_caps / set_all_caps).
Adds 48 new tests; coverage stays at 97.32%.

Co-Authored-By: Claude Sonnet 4.6 <noreply@anthropic.com>
</commit_message>
<xml_diff>
--- a/tests/fixtures/showcase.docx
+++ b/tests/fixtures/showcase.docx
@@ -423,6 +423,21 @@
           <w:i/>
         </w:rPr>
         <w:t xml:space="preserve">Bold + Italic</w:t>
+      </w:r>
+    </w:p>
+    <w:p>
+      <w:pPr/>
+      <w:r>
+        <w:rPr>
+          <w:smallCaps/>
+        </w:rPr>
+        <w:t xml:space="preserve">Small Caps  </w:t>
+      </w:r>
+      <w:r>
+        <w:rPr>
+          <w:caps/>
+        </w:rPr>
+        <w:t xml:space="preserve">All Caps</w:t>
       </w:r>
     </w:p>
     <w:p>

</xml_diff>

<commit_message>
feat: add tab stop support (w:tabs, w:tab run element)
Implements paragraph-level tab stop definitions (w:tabs/w:tab with
alignment, position, and leader) and the tab character run element
(w:tab inside w:r). Adds TabStop frozen dataclass, set_tab_stops() on
MutableParagraph, and serializes to data-dw-tab-stops for round-trip.
47 new tests; coverage 97.29%.

Co-Authored-By: Claude Sonnet 4.6 <noreply@anthropic.com>
</commit_message>
<xml_diff>
--- a/tests/fixtures/showcase.docx
+++ b/tests/fixtures/showcase.docx
@@ -1412,6 +1412,58 @@
         </w:tc>
       </w:tr>
     </w:tbl>
+    <w:p>
+      <w:pPr/>
+      <w:r>
+        <w:t xml:space="preserve">Tab stops define custom horizontal positions for the tab character. The paragraph below has left (72pt), center (216pt), and right (360pt) stops.</w:t>
+      </w:r>
+    </w:p>
+    <w:p>
+      <w:pPr>
+        <w:tabs>
+          <w:tab w:val="left" w:pos="1440"/>
+          <w:tab w:val="center" w:pos="4320"/>
+          <w:tab w:val="right" w:pos="7200"/>
+        </w:tabs>
+      </w:pPr>
+      <w:r>
+        <w:t xml:space="preserve">Left</w:t>
+      </w:r>
+      <w:r>
+        <w:t xml:space="preserve"/>
+        <w:tab/>
+        <w:t xml:space="preserve"/>
+      </w:r>
+      <w:r>
+        <w:t xml:space="preserve">Center</w:t>
+      </w:r>
+      <w:r>
+        <w:t xml:space="preserve"/>
+        <w:tab/>
+        <w:t xml:space="preserve"/>
+      </w:r>
+      <w:r>
+        <w:t xml:space="preserve">Right</w:t>
+      </w:r>
+    </w:p>
+    <w:p>
+      <w:pPr>
+        <w:tabs>
+          <w:tab w:val="right" w:pos="7200" w:leader="dot"/>
+        </w:tabs>
+      </w:pPr>
+      <w:r>
+        <w:t xml:space="preserve">TOC entry</w:t>
+      </w:r>
+      <w:r>
+        <w:t xml:space="preserve"/>
+        <w:tab/>
+        <w:t xml:space="preserve"/>
+      </w:r>
+      <w:r>
+        <w:t xml:space="preserve">42</w:t>
+      </w:r>
+    </w:p>
     <w:p>
       <w:pPr>
         <w:pStyle w:val="Heading1"/>

</xml_diff>

<commit_message>
feat: add cross-reference support (REF field, w:fldChar/w:instrText)
Parses REF fields from DOCX capturing both bookmark name and display
text. Renders as <a class="dw-xref" data-dw-xref="..."> in HTML.
Adds CrossRef frozen model, MutableCrossRef API, and RunCollection
.add_cross_ref(). Field state machine updated to capture display text
between separate/end for all field types. 30 new tests; coverage 97.22%.

Co-Authored-By: Claude Sonnet 4.6 <noreply@anthropic.com>
</commit_message>
<xml_diff>
--- a/tests/fixtures/showcase.docx
+++ b/tests/fixtures/showcase.docx
@@ -1077,11 +1077,49 @@
       </w:r>
     </w:p>
     <w:p>
+      <w:pPr/>
+      <w:r>
+        <w:t xml:space="preserve">Cross-references (REF fields) link to named bookmarks elsewhere in the document:</w:t>
+      </w:r>
+    </w:p>
+    <w:p>
+      <w:pPr/>
+      <w:bookmarkStart w:id="10" w:name="xref-target"/>
+      <w:bookmarkEnd w:id="10"/>
+      <w:r>
+        <w:t xml:space="preserve">This paragraph is the cross-reference target (bookmark: xref-target).</w:t>
+      </w:r>
+    </w:p>
+    <w:p>
+      <w:pPr/>
+      <w:r>
+        <w:t xml:space="preserve">Jump to: </w:t>
+      </w:r>
+      <w:r>
+        <w:fldChar w:fldCharType="begin"/>
+      </w:r>
+      <w:r>
+        <w:instrText xml:space="preserve"> REF xref-target \h </w:instrText>
+      </w:r>
+      <w:r>
+        <w:fldChar w:fldCharType="separate"/>
+      </w:r>
+      <w:r>
+        <w:t xml:space="preserve">the target paragraph</w:t>
+      </w:r>
+      <w:r>
+        <w:fldChar w:fldCharType="end"/>
+      </w:r>
+      <w:r>
+        <w:t xml:space="preserve">.</w:t>
+      </w:r>
+    </w:p>
+    <w:p>
       <w:pPr>
         <w:pStyle w:val="Heading1"/>
       </w:pPr>
-      <w:bookmarkStart w:id="10" w:name="showcase-footnotes"/>
-      <w:bookmarkEnd w:id="10"/>
+      <w:bookmarkStart w:id="11" w:name="showcase-footnotes"/>
+      <w:bookmarkEnd w:id="11"/>
       <w:r>
         <w:t xml:space="preserve">Footnotes and Endnotes</w:t>
       </w:r>
@@ -1129,8 +1167,8 @@
       <w:pPr>
         <w:pStyle w:val="Heading1"/>
       </w:pPr>
-      <w:bookmarkStart w:id="11" w:name="showcase-comments"/>
-      <w:bookmarkEnd w:id="11"/>
+      <w:bookmarkStart w:id="12" w:name="showcase-comments"/>
+      <w:bookmarkEnd w:id="12"/>
       <w:r>
         <w:t xml:space="preserve">Comments</w:t>
       </w:r>
@@ -1179,8 +1217,8 @@
       <w:pPr>
         <w:pStyle w:val="Heading1"/>
       </w:pPr>
-      <w:bookmarkStart w:id="12" w:name="showcase-track-changes"/>
-      <w:bookmarkEnd w:id="12"/>
+      <w:bookmarkStart w:id="13" w:name="showcase-track-changes"/>
+      <w:bookmarkEnd w:id="13"/>
       <w:r>
         <w:t xml:space="preserve">Track Changes</w:t>
       </w:r>
@@ -1233,8 +1271,8 @@
       <w:pPr>
         <w:pStyle w:val="Heading1"/>
       </w:pPr>
-      <w:bookmarkStart w:id="13" w:name="showcase-pagebreaks"/>
-      <w:bookmarkEnd w:id="13"/>
+      <w:bookmarkStart w:id="14" w:name="showcase-pagebreaks"/>
+      <w:bookmarkEnd w:id="14"/>
       <w:r>
         <w:t xml:space="preserve">Page Breaks</w:t>
       </w:r>
@@ -1260,8 +1298,8 @@
       <w:pPr>
         <w:pStyle w:val="Heading1"/>
       </w:pPr>
-      <w:bookmarkStart w:id="14" w:name="showcase-pagefields"/>
-      <w:bookmarkEnd w:id="14"/>
+      <w:bookmarkStart w:id="15" w:name="showcase-pagefields"/>
+      <w:bookmarkEnd w:id="15"/>
       <w:r>
         <w:t xml:space="preserve">Page Number Fields</w:t>
       </w:r>
@@ -1326,8 +1364,8 @@
       <w:pPr>
         <w:pStyle w:val="Heading1"/>
       </w:pPr>
-      <w:bookmarkStart w:id="15" w:name="showcase-shading"/>
-      <w:bookmarkEnd w:id="15"/>
+      <w:bookmarkStart w:id="16" w:name="showcase-shading"/>
+      <w:bookmarkEnd w:id="16"/>
       <w:r>
         <w:t xml:space="preserve">Shading</w:t>
       </w:r>
@@ -1468,8 +1506,8 @@
       <w:pPr>
         <w:pStyle w:val="Heading1"/>
       </w:pPr>
-      <w:bookmarkStart w:id="16" w:name="showcase-hf"/>
-      <w:bookmarkEnd w:id="16"/>
+      <w:bookmarkStart w:id="17" w:name="showcase-hf"/>
+      <w:bookmarkEnd w:id="17"/>
       <w:r>
         <w:t xml:space="preserve">Headers and Footers</w:t>
       </w:r>

</xml_diff>

<commit_message>
feat: add multiple sections support (w:sectPr, SectionBreak, MutableSectionBreak)
Parses w:sectPr from section break paragraphs (w:pPr/w:sectPr),
creating inline SectionBreak body elements with independent page size,
margins, and break type. Renders as hidden data-dw-section-break divs
for round-trip. Refactors _parse_page_geometry to use shared
parse_sect_pr helper. Adds MutableSectionBreak API and
ParagraphCollection.add_section_break(). 38 new tests; coverage 97.24%.

Co-Authored-By: Claude Sonnet 4.6 <noreply@anthropic.com>
</commit_message>
<xml_diff>
--- a/tests/fixtures/showcase.docx
+++ b/tests/fixtures/showcase.docx
@@ -1500,6 +1500,27 @@
       </w:r>
       <w:r>
         <w:t xml:space="preserve">42</w:t>
+      </w:r>
+    </w:p>
+    <w:p>
+      <w:pPr/>
+      <w:r>
+        <w:t xml:space="preserve">Section breaks divide the document into sections with independent page geometry. The paragraph below ends Section A; what follows is in Section B (landscape A4).</w:t>
+      </w:r>
+    </w:p>
+    <w:p>
+      <w:pPr>
+        <w:sectPr>
+          <w:type w:val="nextPage"/>
+          <w:pgSz w:w="16838" w:h="11906"/>
+          <w:pgMar w:top="1080" w:right="1440" w:bottom="1080" w:left="1440"/>
+        </w:sectPr>
+      </w:pPr>
+    </w:p>
+    <w:p>
+      <w:pPr/>
+      <w:r>
+        <w:t xml:space="preserve">This paragraph is in Section B (landscape A4, 54pt top/bottom margins). Section breaks are invisible in HTML but round-trip losslessly to DOCX.</w:t>
       </w:r>
     </w:p>
     <w:p>

</xml_diff>

<commit_message>
fix: add missing heading and TOC entry for Multiple Sections in showcase
Co-Authored-By: Claude Sonnet 4.6 <noreply@anthropic.com>
</commit_message>
<xml_diff>
--- a/tests/fixtures/showcase.docx
+++ b/tests/fixtures/showcase.docx
@@ -172,6 +172,16 @@
           <w:hyperlink w:anchor="showcase-shading">
             <w:r>
               <w:t xml:space="preserve">Shading</w:t>
+            </w:r>
+          </w:hyperlink>
+        </w:p>
+        <w:p>
+          <w:pPr>
+            <w:pStyle w:val="TOC1"/>
+          </w:pPr>
+          <w:hyperlink w:anchor="showcase-sections">
+            <w:r>
+              <w:t xml:space="preserve">Multiple Sections</w:t>
             </w:r>
           </w:hyperlink>
         </w:p>
@@ -1503,6 +1513,16 @@
       </w:r>
     </w:p>
     <w:p>
+      <w:pPr>
+        <w:pStyle w:val="Heading1"/>
+      </w:pPr>
+      <w:bookmarkStart w:id="17" w:name="showcase-sections"/>
+      <w:bookmarkEnd w:id="17"/>
+      <w:r>
+        <w:t xml:space="preserve">Multiple Sections</w:t>
+      </w:r>
+    </w:p>
+    <w:p>
       <w:pPr/>
       <w:r>
         <w:t xml:space="preserve">Section breaks divide the document into sections with independent page geometry. The paragraph below ends Section A; what follows is in Section B (landscape A4).</w:t>
@@ -1527,8 +1547,8 @@
       <w:pPr>
         <w:pStyle w:val="Heading1"/>
       </w:pPr>
-      <w:bookmarkStart w:id="17" w:name="showcase-hf"/>
-      <w:bookmarkEnd w:id="17"/>
+      <w:bookmarkStart w:id="18" w:name="showcase-hf"/>
+      <w:bookmarkEnd w:id="18"/>
       <w:r>
         <w:t xml:space="preserve">Headers and Footers</w:t>
       </w:r>

</xml_diff>